<commit_message>
Fix PR13 research grounding
</commit_message>
<xml_diff>
--- a/ИС-31_Хасанов_ПЗ№17_Техническое_задание.docx
+++ b/ИС-31_Хасанов_ПЗ№17_Техническое_задание.docx
@@ -927,24 +927,10 @@
       </w:pPr>
       <w:r>
         <w:rPr>
-          <w:lang w:val="ru-RU"/>
-        </w:rPr>
-        <w:t xml:space="preserve">Основная аудитория — пользователи </w:t>
-      </w:r>
-      <w:r>
-        <w:t>Android</w:t>
-      </w:r>
-      <w:r>
-        <w:rPr>
-          <w:lang w:val="ru-RU"/>
-        </w:rPr>
-        <w:t xml:space="preserve"> в возрасте ориентировочно 18–45 лет, которые регулярно читают электронные книги и могут использовать озвучивание текста в течение дня. В аудиторию входят студенты, специали</w:t>
-      </w:r>
-      <w:r>
-        <w:rPr>
-          <w:lang w:val="ru-RU"/>
-        </w:rPr>
-        <w:t>сты и самостоятельные читатели, которым важны доступность библиотеки и быстрый переход между чтением и прослушиванием.</w:t>
+          <w:rFonts w:ascii="Times New Roman" w:hAnsi="Times New Roman"/>
+          <w:sz w:val="28"/>
+        </w:rPr>
+        <w:t>Рабочая гипотеза целевой аудитории — взрослые пользователи Android, регулярно читающие электронные книги и использующие озвучивание текста как дополнительный способ потребления контента. Возраст 18–49 лет рассматривается как ориентир, а не как утверждённая демографическая граница: внешний источник по читательским привычкам США показывает заметное использование электронных книг и аудиокниг в группах 18–29 и 30–49 лет. Для российского рынка эти цифры напрямую не переносятся и требуют локальной проверки [6].</w:t>
       </w:r>
     </w:p>
     <w:p>
@@ -1266,55 +1252,10 @@
       </w:pPr>
       <w:r>
         <w:rPr>
-          <w:lang w:val="ru-RU"/>
-        </w:rPr>
-        <w:t>В качестве ориен</w:t>
-      </w:r>
-      <w:r>
-        <w:rPr>
-          <w:lang w:val="ru-RU"/>
-        </w:rPr>
-        <w:t xml:space="preserve">тиров конкурентной среды рассматриваются мобильные читалки </w:t>
-      </w:r>
-      <w:proofErr w:type="spellStart"/>
-      <w:r>
-        <w:t>ReadEra</w:t>
-      </w:r>
-      <w:proofErr w:type="spellEnd"/>
-      <w:r>
-        <w:rPr>
-          <w:lang w:val="ru-RU"/>
-        </w:rPr>
-        <w:t xml:space="preserve">, </w:t>
-      </w:r>
-      <w:proofErr w:type="spellStart"/>
-      <w:r>
-        <w:t>FBReader</w:t>
-      </w:r>
-      <w:proofErr w:type="spellEnd"/>
-      <w:r>
-        <w:rPr>
-          <w:lang w:val="ru-RU"/>
-        </w:rPr>
-        <w:t xml:space="preserve"> и </w:t>
-      </w:r>
-      <w:r>
-        <w:t>Moon</w:t>
-      </w:r>
-      <w:r>
-        <w:rPr>
-          <w:lang w:val="ru-RU"/>
-        </w:rPr>
-        <w:t xml:space="preserve">+ </w:t>
-      </w:r>
-      <w:r>
-        <w:t>Reader</w:t>
-      </w:r>
-      <w:r>
-        <w:rPr>
-          <w:lang w:val="ru-RU"/>
-        </w:rPr>
-        <w:t>, а также другие приложения, работающие с электронными книгами и озвучиванием текста.</w:t>
+          <w:rFonts w:ascii="Times New Roman" w:hAnsi="Times New Roman"/>
+          <w:sz w:val="28"/>
+        </w:rPr>
+        <w:t>В результате анализа конкурентной среды выделены пять релевантных аналогов: ReadEra, FBReader, Moon+ Reader, PocketBook Reader и Kindle. Они выбраны по принадлежности к категории мобильного чтения и по пересечению с функциями FB2 и/или TTS [1–5].</w:t>
       </w:r>
     </w:p>
     <w:p>
@@ -1348,22 +1289,12 @@
           <w:lang w:val="ru-RU"/>
         </w:rPr>
       </w:pPr>
-      <w:proofErr w:type="spellStart"/>
-      <w:r>
-        <w:t>BookReader</w:t>
-      </w:r>
-      <w:proofErr w:type="spellEnd"/>
-      <w:r>
-        <w:rPr>
-          <w:lang w:val="ru-RU"/>
-        </w:rPr>
-        <w:t xml:space="preserve"> должен отличаться не</w:t>
-      </w:r>
-      <w:r>
-        <w:rPr>
-          <w:lang w:val="ru-RU"/>
-        </w:rPr>
-        <w:t xml:space="preserve"> попыткой вместить максимум настроек на один экран, а более сдержанной визуальной системой с чёткой иерархией: книга и текущий текст являются главным содержанием, а управляющие элементы подчинены этому содержанию.</w:t>
+      <w:r>
+        <w:rPr>
+          <w:rFonts w:ascii="Times New Roman" w:hAnsi="Times New Roman"/>
+          <w:sz w:val="28"/>
+        </w:rPr>
+        <w:t>По результатам анализа конкурентов BookReader целесообразно отличать фокусом на базовом сценарии «найти книгу — открыть — читать или слушать», а не количеством функций. У крупных аналогов уже присутствуют расширенные библиотеки, множество форматов, темы, заметки, синхронизация и TTS [1–5]. Поэтому конкурентное отличие разумно строить вокруг простоты сценария и приоритета текста.</w:t>
       </w:r>
     </w:p>
     <w:p>
@@ -1394,15 +1325,10 @@
       </w:pPr>
       <w:r>
         <w:rPr>
-          <w:lang w:val="ru-RU"/>
-        </w:rPr>
-        <w:t>Ориентиром являются понятная библиотека, хорошо заметная навигация по книге, предсказуемая работа элементов управления и наличие отдельной зоны настроек. При анализе референсов следует заимствовать принципы, а не копировать конкретные</w:t>
-      </w:r>
-      <w:r>
-        <w:rPr>
-          <w:lang w:val="ru-RU"/>
-        </w:rPr>
-        <w:t xml:space="preserve"> экраны или графические элементы.</w:t>
+          <w:rFonts w:ascii="Times New Roman" w:hAnsi="Times New Roman"/>
+          <w:sz w:val="28"/>
+        </w:rPr>
+        <w:t>При визуальном анализе аналогов повторяются понятная библиотека, читаемый экран книги и отдельные элементы управления/настроек. В качестве ориентиров берутся эти принципы, а не конкретные композиции. Одновременно видно, что часть конкурентов перегружает продукт функциями, поэтому для BookReader выбран более сдержанный сценарий [1–5].</w:t>
       </w:r>
     </w:p>
     <w:p>
@@ -1427,15 +1353,10 @@
       </w:pPr>
       <w:r>
         <w:rPr>
-          <w:lang w:val="ru-RU"/>
-        </w:rPr>
-        <w:t>Нежелательны перегруженные панели инструментов, большое количество равнозначных кнопок, декоративные градиенты, чрезмерно яркие цвета, крупные иллюстрации без функциональной роли, сложные ор</w:t>
-      </w:r>
-      <w:r>
-        <w:rPr>
-          <w:lang w:val="ru-RU"/>
-        </w:rPr>
-        <w:t>наменты и визуальная конкуренция между обложкой, текстом и элементами управления.</w:t>
+          <w:rFonts w:ascii="Times New Roman" w:hAnsi="Times New Roman"/>
+          <w:sz w:val="28"/>
+        </w:rPr>
+        <w:t>Нежелательные решения сформулированы как вывод визуального аудита: визуальный шум, конкурирующие акценты и декоративность без функции ухудшают иерархию интерфейса. Это также согласуется с требованиями к читаемости и различимости действий мобильного интерфейса [1–5, 7].</w:t>
       </w:r>
     </w:p>
     <w:p>
@@ -1474,15 +1395,10 @@
       </w:pPr>
       <w:r>
         <w:rPr>
-          <w:lang w:val="ru-RU"/>
-        </w:rPr>
-        <w:t>Основное направление — минималистичный тёмный цифровой стиль. Композиция должна строиться на контрас</w:t>
-      </w:r>
-      <w:r>
-        <w:rPr>
-          <w:lang w:val="ru-RU"/>
-        </w:rPr>
-        <w:t>те фона, текста и небольшого количества акцентных элементов. Главный визуальный объект интерфейса — содержание книги.</w:t>
+          <w:rFonts w:ascii="Times New Roman" w:hAnsi="Times New Roman"/>
+          <w:sz w:val="28"/>
+        </w:rPr>
+        <w:t>После анализа пяти аналогов выбрано предварительное направление: минималистичный тёмный цифровой стиль с одним акцентным цветом. Это не утверждение о «правильном» стиле рынка, а проектный вывод из исследования: категория активно использует цветные акценты и буквальные образы книги, поэтому BookReader целесообразно сместить акцент на спокойное пространство для текста и связь чтения с озвучиванием [1–5].</w:t>
       </w:r>
     </w:p>
     <w:p>
@@ -1507,121 +1423,10 @@
       </w:pPr>
       <w:r>
         <w:rPr>
-          <w:highlight w:val="yellow"/>
-          <w:lang w:val="ru-RU"/>
-        </w:rPr>
-        <w:t>Предварительная цветовая система строится на пяти ролях: основной фон #0</w:t>
-      </w:r>
-      <w:r>
-        <w:rPr>
-          <w:highlight w:val="yellow"/>
-        </w:rPr>
-        <w:t>F</w:t>
-      </w:r>
-      <w:r>
-        <w:rPr>
-          <w:highlight w:val="yellow"/>
-          <w:lang w:val="ru-RU"/>
-        </w:rPr>
-        <w:t>1115, поверхность #171</w:t>
-      </w:r>
-      <w:r>
-        <w:rPr>
-          <w:highlight w:val="yellow"/>
-        </w:rPr>
-        <w:t>A</w:t>
-      </w:r>
-      <w:r>
-        <w:rPr>
-          <w:highlight w:val="yellow"/>
-          <w:lang w:val="ru-RU"/>
-        </w:rPr>
-        <w:t>21, основн</w:t>
-      </w:r>
-      <w:r>
-        <w:rPr>
-          <w:highlight w:val="yellow"/>
-          <w:lang w:val="ru-RU"/>
-        </w:rPr>
-        <w:t>ой текст #</w:t>
-      </w:r>
-      <w:r>
-        <w:rPr>
-          <w:highlight w:val="yellow"/>
-        </w:rPr>
-        <w:t>F</w:t>
-      </w:r>
-      <w:r>
-        <w:rPr>
-          <w:highlight w:val="yellow"/>
-          <w:lang w:val="ru-RU"/>
-        </w:rPr>
-        <w:t>4</w:t>
-      </w:r>
-      <w:r>
-        <w:rPr>
-          <w:highlight w:val="yellow"/>
-        </w:rPr>
-        <w:t>F</w:t>
-      </w:r>
-      <w:r>
-        <w:rPr>
-          <w:highlight w:val="yellow"/>
-          <w:lang w:val="ru-RU"/>
-        </w:rPr>
-        <w:t>6</w:t>
-      </w:r>
-      <w:r>
-        <w:rPr>
-          <w:highlight w:val="yellow"/>
-        </w:rPr>
-        <w:t>F</w:t>
-      </w:r>
-      <w:r>
-        <w:rPr>
-          <w:highlight w:val="yellow"/>
-          <w:lang w:val="ru-RU"/>
-        </w:rPr>
-        <w:t>8, вторичный текст #9</w:t>
-      </w:r>
-      <w:r>
-        <w:rPr>
-          <w:highlight w:val="yellow"/>
-        </w:rPr>
-        <w:t>AA</w:t>
-      </w:r>
-      <w:r>
-        <w:rPr>
-          <w:highlight w:val="yellow"/>
-          <w:lang w:val="ru-RU"/>
-        </w:rPr>
-        <w:t>4</w:t>
-      </w:r>
-      <w:r>
-        <w:rPr>
-          <w:highlight w:val="yellow"/>
-        </w:rPr>
-        <w:t>B</w:t>
-      </w:r>
-      <w:r>
-        <w:rPr>
-          <w:highlight w:val="yellow"/>
-          <w:lang w:val="ru-RU"/>
-        </w:rPr>
-        <w:t>2 и акцент #3498</w:t>
-      </w:r>
-      <w:r>
-        <w:rPr>
-          <w:highlight w:val="yellow"/>
-        </w:rPr>
-        <w:t>F</w:t>
-      </w:r>
-      <w:r>
-        <w:rPr>
-          <w:highlight w:val="yellow"/>
-          <w:lang w:val="ru-RU"/>
-        </w:rPr>
-        <w:t>5. Палитра является основой для последующей разработки фирменного стиля; количество самостоятельных акцентных цветов должно оставаться ограниченным.</w:t>
+          <w:rFonts w:ascii="Times New Roman" w:hAnsi="Times New Roman"/>
+          <w:sz w:val="28"/>
+        </w:rPr>
+        <w:t>Предварительная палитра является рабочей гипотезой, выведенной из визуального аудита конкурентов и из уже существующего интерфейса BookReader. Тёмная нейтральная основа должна отличать проект от часто встречающихся ярких синих, оранжевых, красных и многоцветных иконок категории; единый синий акцент сохраняется как наследуемый элемент интерфейса. Точные значения #0F1115, #171A21, #F4F6F8, #9AA4B2 и #3498F5 не выдаются за результат исследования аудитории и подлежат проверке на контраст в прототипе [1–5, 7].</w:t>
       </w:r>
     </w:p>
     <w:p>
@@ -1647,50 +1452,10 @@
       </w:pPr>
       <w:r>
         <w:rPr>
-          <w:highlight w:val="yellow"/>
-          <w:lang w:val="ru-RU"/>
-        </w:rPr>
-        <w:t>Для цифр</w:t>
-      </w:r>
-      <w:r>
-        <w:rPr>
-          <w:highlight w:val="yellow"/>
-          <w:lang w:val="ru-RU"/>
-        </w:rPr>
-        <w:t xml:space="preserve">овых носителей закрепляются следующие правила: единая типографическая иерархия; базовая сетка отступов 8 </w:t>
-      </w:r>
-      <w:r>
-        <w:rPr>
-          <w:highlight w:val="yellow"/>
-        </w:rPr>
-        <w:t>dp</w:t>
-      </w:r>
-      <w:r>
-        <w:rPr>
-          <w:highlight w:val="yellow"/>
-          <w:lang w:val="ru-RU"/>
-        </w:rPr>
-        <w:t xml:space="preserve">; скругление карточек и полей в диапазоне 10–12 </w:t>
-      </w:r>
-      <w:r>
-        <w:rPr>
-          <w:highlight w:val="yellow"/>
-        </w:rPr>
-        <w:t>dp</w:t>
-      </w:r>
-      <w:r>
-        <w:rPr>
-          <w:highlight w:val="yellow"/>
-          <w:lang w:val="ru-RU"/>
-        </w:rPr>
-        <w:t>; линейные иконки в единой толщине штриха; отсутствие декоративных градиентов и сильных теней; один</w:t>
-      </w:r>
-      <w:r>
-        <w:rPr>
-          <w:highlight w:val="yellow"/>
-          <w:lang w:val="ru-RU"/>
-        </w:rPr>
-        <w:t xml:space="preserve"> главный акцентный цвет для интерактивных состояний. Обложка книги может быть главным изображением карточки, но не должна перекрывать читаемость названия и автора.</w:t>
+          <w:rFonts w:ascii="Times New Roman" w:hAnsi="Times New Roman"/>
+          <w:sz w:val="28"/>
+        </w:rPr>
+        <w:t>Для цифровых носителей закрепляются только правила с понятным основанием: единая иерархия текста — по принципам Material 3; умеренное скругление — в пределах типовых форм Material; высокий контраст текста и фона — как требование доступности Android [7]. Конкретные значения сетки, радиусов и толщины линий остаются рабочими параметрами и проверяются на прототипе.</w:t>
       </w:r>
     </w:p>
     <w:p>
@@ -1715,27 +1480,10 @@
       </w:pPr>
       <w:r>
         <w:rPr>
-          <w:lang w:val="ru-RU"/>
-        </w:rPr>
-        <w:t xml:space="preserve">Основным шрифтом цифрового интерфейса предлагается </w:t>
-      </w:r>
-      <w:r>
-        <w:t>Int</w:t>
-      </w:r>
-      <w:r>
-        <w:t>er</w:t>
-      </w:r>
-      <w:r>
-        <w:rPr>
-          <w:lang w:val="ru-RU"/>
-        </w:rPr>
-        <w:t xml:space="preserve"> с нейтральным системным резервом. Для текста книги приоритет имеет комфорт чтения: достаточный размер, межстрочный интервал, контраст и спокойная форма символов. Заголовки, метаданные и управляющие элементы должны иметь устойчивую иерархию, чтобы пользо</w:t>
-      </w:r>
-      <w:r>
-        <w:rPr>
-          <w:lang w:val="ru-RU"/>
-        </w:rPr>
-        <w:t>ватель различал их без дополнительных декоративных эффектов.</w:t>
+          <w:rFonts w:ascii="Times New Roman" w:hAnsi="Times New Roman"/>
+          <w:sz w:val="28"/>
+        </w:rPr>
+        <w:t>Для интерфейса предлагается Inter как рабочий кандидат, но выбор шрифта не считается окончательно доказанным результатом исследования. Обоснованный результат исследования — явная типографическая иерархия, различимая размером, насыщенностью и межстрочным интервалом, а также достаточный контраст текста [7].</w:t>
       </w:r>
     </w:p>
     <w:p>
@@ -1760,15 +1508,10 @@
       </w:pPr>
       <w:r>
         <w:rPr>
-          <w:lang w:val="ru-RU"/>
-        </w:rPr>
-        <w:t xml:space="preserve">Подходят простые геометрические формы, линейные иконки, ограниченная толщина штриха и повторяемые визуальные модули. Логотип в дальнейшем должен </w:t>
-      </w:r>
-      <w:r>
-        <w:rPr>
-          <w:lang w:val="ru-RU"/>
-        </w:rPr>
-        <w:t>быть лаконичным, различимым в маленьком размере и допускать ассоциации с книгой и звуком без буквального изображения наушников или раскрытой книги.</w:t>
+          <w:rFonts w:ascii="Times New Roman" w:hAnsi="Times New Roman"/>
+          <w:sz w:val="28"/>
+        </w:rPr>
+        <w:t>Визуальный аудит показал повторяющийся буквальный код категории: открытая книга, закладка, группа книг, луна и другие прямые метафоры чтения [1–5]. Поэтому для BookReader выбран принцип отличия через переход «текст → звук»: строки текста и ритм могут преобразовываться в абстрактный звуковой сигнал. Геометрия и линейная иконография остаются проектным решением.</w:t>
       </w:r>
     </w:p>
     <w:p>
@@ -1793,15 +1536,10 @@
       </w:pPr>
       <w:r>
         <w:rPr>
-          <w:lang w:val="ru-RU"/>
-        </w:rPr>
-        <w:t>Не подходят кислотные и многочисленные акцентные цвета, фотореалистичны</w:t>
-      </w:r>
-      <w:r>
-        <w:rPr>
-          <w:lang w:val="ru-RU"/>
-        </w:rPr>
-        <w:t>е декоративные изображения, сложные текстуры, псевдообъёмные элементы, большое количество теней, стеклянные эффекты, декоративные орнаменты и стилистически разрозненные иконки.</w:t>
+          <w:rFonts w:ascii="Times New Roman" w:hAnsi="Times New Roman"/>
+          <w:sz w:val="28"/>
+        </w:rPr>
+        <w:t>Не подходят решения, которые разрушают приоритет текста и иерархию действий: лишняя декоративность, множество равнозначных акцентов, псевдообъём и визуально разрозненные элементы. Вывод сделан из сопоставления визуальных кодов аналогов и требований к читаемости мобильного интерфейса [1–5, 7].</w:t>
       </w:r>
     </w:p>
     <w:p>
@@ -2740,272 +2478,1055 @@
     </w:p>
     <w:p>
       <w:pPr>
-        <w:pStyle w:val="1"/>
-        <w:rPr>
-          <w:lang w:val="ru-RU"/>
-        </w:rPr>
-      </w:pPr>
-      <w:r>
-        <w:rPr>
-          <w:lang w:val="ru-RU"/>
-        </w:rPr>
-        <w:t>3. Тех</w:t>
-      </w:r>
-      <w:r>
-        <w:rPr>
-          <w:lang w:val="ru-RU"/>
-        </w:rPr>
-        <w:t>ническое задание</w:t>
+        <w:pStyle w:val="21"/>
+      </w:pPr>
+      <w:r>
+        <w:rPr>
+          <w:rFonts w:ascii="Times New Roman" w:hAnsi="Times New Roman"/>
+          <w:b/>
+          <w:sz w:val="28"/>
+        </w:rPr>
+        <w:t>2.11. Исследовательское обоснование решений</w:t>
       </w:r>
     </w:p>
     <w:p>
       <w:pPr>
-        <w:pStyle w:val="21"/>
-        <w:rPr>
-          <w:lang w:val="ru-RU"/>
-        </w:rPr>
-      </w:pPr>
-      <w:r>
-        <w:rPr>
-          <w:lang w:val="ru-RU"/>
-        </w:rPr>
-        <w:t>3.1. Цель проекта</w:t>
+        <w:spacing w:line="360" w:lineRule="auto"/>
+        <w:ind w:firstLine="709"/>
+        <w:jc w:val="both"/>
+      </w:pPr>
+      <w:r>
+        <w:rPr>
+          <w:rFonts w:ascii="Times New Roman" w:hAnsi="Times New Roman"/>
+          <w:sz w:val="28"/>
+        </w:rPr>
+        <w:t>Исследование выполнено для частей брифа, где появляются утверждения о пользователях, конкурентной среде и визуальном языке. Использованы анализ карточек приложений и их функций в Google Play и на официальном сайте FBReader, визуальный аудит значков и интерфейсных приёмов аналогов, сопоставление сценариев чтения и озвучивания, а также сверка цифровых правил с рекомендациями Android и Material 3. Это позволяет отделить фактические данные от рабочих дизайнерских гипотез.</w:t>
+      </w:r>
+    </w:p>
+    <w:tbl>
+      <w:tblPr>
+        <w:tblStyle w:val="aff0"/>
+        <w:tblW w:type="auto" w:w="0"/>
+        <w:jc w:val="center"/>
+        <w:tblLook w:firstColumn="1" w:firstRow="1" w:lastColumn="0" w:lastRow="0" w:noHBand="0" w:noVBand="1" w:val="04A0"/>
+      </w:tblPr>
+      <w:tblGrid>
+        <w:gridCol w:w="2480"/>
+        <w:gridCol w:w="2480"/>
+        <w:gridCol w:w="2480"/>
+        <w:gridCol w:w="2480"/>
+      </w:tblGrid>
+      <w:tr>
+        <w:tc>
+          <w:tcPr>
+            <w:tcW w:type="dxa" w:w="2480"/>
+            <w:vAlign w:val="center"/>
+            <w:shd w:fill="D9EAF7"/>
+          </w:tcPr>
+          <w:p>
+            <w:pPr>
+              <w:jc w:val="center"/>
+            </w:pPr>
+            <w:r>
+              <w:rPr>
+                <w:rFonts w:ascii="Times New Roman" w:hAnsi="Times New Roman"/>
+                <w:b/>
+                <w:sz w:val="20"/>
+              </w:rPr>
+              <w:t>Аналог</w:t>
+            </w:r>
+          </w:p>
+        </w:tc>
+        <w:tc>
+          <w:tcPr>
+            <w:tcW w:type="dxa" w:w="2480"/>
+            <w:vAlign w:val="center"/>
+            <w:shd w:fill="D9EAF7"/>
+          </w:tcPr>
+          <w:p>
+            <w:pPr>
+              <w:jc w:val="center"/>
+            </w:pPr>
+            <w:r>
+              <w:rPr>
+                <w:rFonts w:ascii="Times New Roman" w:hAnsi="Times New Roman"/>
+                <w:b/>
+                <w:sz w:val="20"/>
+              </w:rPr>
+              <w:t>Факты исследования</w:t>
+            </w:r>
+          </w:p>
+        </w:tc>
+        <w:tc>
+          <w:tcPr>
+            <w:tcW w:type="dxa" w:w="2480"/>
+            <w:vAlign w:val="center"/>
+            <w:shd w:fill="D9EAF7"/>
+          </w:tcPr>
+          <w:p>
+            <w:pPr>
+              <w:jc w:val="center"/>
+            </w:pPr>
+            <w:r>
+              <w:rPr>
+                <w:rFonts w:ascii="Times New Roman" w:hAnsi="Times New Roman"/>
+                <w:b/>
+                <w:sz w:val="20"/>
+              </w:rPr>
+              <w:t>Наблюдение по визуальному коду</w:t>
+            </w:r>
+          </w:p>
+        </w:tc>
+        <w:tc>
+          <w:tcPr>
+            <w:tcW w:type="dxa" w:w="2480"/>
+            <w:vAlign w:val="center"/>
+            <w:shd w:fill="D9EAF7"/>
+          </w:tcPr>
+          <w:p>
+            <w:pPr>
+              <w:jc w:val="center"/>
+            </w:pPr>
+            <w:r>
+              <w:rPr>
+                <w:rFonts w:ascii="Times New Roman" w:hAnsi="Times New Roman"/>
+                <w:b/>
+                <w:sz w:val="20"/>
+              </w:rPr>
+              <w:t>Вывод для BookReader</w:t>
+            </w:r>
+          </w:p>
+        </w:tc>
+      </w:tr>
+      <w:tr>
+        <w:tc>
+          <w:tcPr>
+            <w:tcW w:type="dxa" w:w="2480"/>
+          </w:tcPr>
+          <w:p>
+            <w:pPr>
+              <w:spacing w:line="240" w:lineRule="auto"/>
+            </w:pPr>
+            <w:r>
+              <w:rPr>
+                <w:rFonts w:ascii="Times New Roman" w:hAnsi="Times New Roman"/>
+                <w:sz w:val="19"/>
+              </w:rPr>
+              <w:t>ReadEra</w:t>
+            </w:r>
+          </w:p>
+        </w:tc>
+        <w:tc>
+          <w:tcPr>
+            <w:tcW w:type="dxa" w:w="2480"/>
+          </w:tcPr>
+          <w:p>
+            <w:pPr>
+              <w:spacing w:line="240" w:lineRule="auto"/>
+            </w:pPr>
+            <w:r>
+              <w:rPr>
+                <w:rFonts w:ascii="Times New Roman" w:hAnsi="Times New Roman"/>
+                <w:sz w:val="19"/>
+              </w:rPr>
+              <w:t>50 млн+ установок; 1,58 млн отзывов; FB2, EPUB, PDF и др.; библиотека и настройки; в актуальном описании отмечено улучшение TTS.</w:t>
+            </w:r>
+          </w:p>
+        </w:tc>
+        <w:tc>
+          <w:tcPr>
+            <w:tcW w:type="dxa" w:w="2480"/>
+          </w:tcPr>
+          <w:p>
+            <w:pPr>
+              <w:spacing w:line="240" w:lineRule="auto"/>
+            </w:pPr>
+            <w:r>
+              <w:rPr>
+                <w:rFonts w:ascii="Times New Roman" w:hAnsi="Times New Roman"/>
+                <w:sz w:val="19"/>
+              </w:rPr>
+              <w:t>Библиотека и мультформатность; буквальная книга/закладка.</w:t>
+            </w:r>
+          </w:p>
+        </w:tc>
+        <w:tc>
+          <w:tcPr>
+            <w:tcW w:type="dxa" w:w="2480"/>
+          </w:tcPr>
+          <w:p>
+            <w:pPr>
+              <w:spacing w:line="240" w:lineRule="auto"/>
+            </w:pPr>
+            <w:r>
+              <w:rPr>
+                <w:rFonts w:ascii="Times New Roman" w:hAnsi="Times New Roman"/>
+                <w:sz w:val="19"/>
+              </w:rPr>
+              <w:t>Не копировать категорийный знак; сделать акцент на связке чтение + слушание. [1]</w:t>
+            </w:r>
+          </w:p>
+        </w:tc>
+      </w:tr>
+      <w:tr>
+        <w:tc>
+          <w:tcPr>
+            <w:tcW w:type="dxa" w:w="2480"/>
+          </w:tcPr>
+          <w:p>
+            <w:pPr>
+              <w:spacing w:line="240" w:lineRule="auto"/>
+            </w:pPr>
+            <w:r>
+              <w:rPr>
+                <w:rFonts w:ascii="Times New Roman" w:hAnsi="Times New Roman"/>
+                <w:sz w:val="19"/>
+              </w:rPr>
+              <w:t>FBReader</w:t>
+            </w:r>
+          </w:p>
+        </w:tc>
+        <w:tc>
+          <w:tcPr>
+            <w:tcW w:type="dxa" w:w="2480"/>
+          </w:tcPr>
+          <w:p>
+            <w:pPr>
+              <w:spacing w:line="240" w:lineRule="auto"/>
+            </w:pPr>
+            <w:r>
+              <w:rPr>
+                <w:rFonts w:ascii="Times New Roman" w:hAnsi="Times New Roman"/>
+                <w:sz w:val="19"/>
+              </w:rPr>
+              <w:t>Поддерживает FB2 и другие форматы; Premium включает чтение вслух текстовых форматов; стабильная Android-версия 3.8.32 опубликована 03.08.2026.</w:t>
+            </w:r>
+          </w:p>
+        </w:tc>
+        <w:tc>
+          <w:tcPr>
+            <w:tcW w:type="dxa" w:w="2480"/>
+          </w:tcPr>
+          <w:p>
+            <w:pPr>
+              <w:spacing w:line="240" w:lineRule="auto"/>
+            </w:pPr>
+            <w:r>
+              <w:rPr>
+                <w:rFonts w:ascii="Times New Roman" w:hAnsi="Times New Roman"/>
+                <w:sz w:val="19"/>
+              </w:rPr>
+              <w:t>Функциональный ридер; прямой образ книги.</w:t>
+            </w:r>
+          </w:p>
+        </w:tc>
+        <w:tc>
+          <w:tcPr>
+            <w:tcW w:type="dxa" w:w="2480"/>
+          </w:tcPr>
+          <w:p>
+            <w:pPr>
+              <w:spacing w:line="240" w:lineRule="auto"/>
+            </w:pPr>
+            <w:r>
+              <w:rPr>
+                <w:rFonts w:ascii="Times New Roman" w:hAnsi="Times New Roman"/>
+                <w:sz w:val="19"/>
+              </w:rPr>
+              <w:t>TTS не уникален; важны простота сценария и собственный графический код. [2]</w:t>
+            </w:r>
+          </w:p>
+        </w:tc>
+      </w:tr>
+      <w:tr>
+        <w:tc>
+          <w:tcPr>
+            <w:tcW w:type="dxa" w:w="2480"/>
+          </w:tcPr>
+          <w:p>
+            <w:pPr>
+              <w:spacing w:line="240" w:lineRule="auto"/>
+            </w:pPr>
+            <w:r>
+              <w:rPr>
+                <w:rFonts w:ascii="Times New Roman" w:hAnsi="Times New Roman"/>
+                <w:sz w:val="19"/>
+              </w:rPr>
+              <w:t>Moon+ Reader</w:t>
+            </w:r>
+          </w:p>
+        </w:tc>
+        <w:tc>
+          <w:tcPr>
+            <w:tcW w:type="dxa" w:w="2480"/>
+          </w:tcPr>
+          <w:p>
+            <w:pPr>
+              <w:spacing w:line="240" w:lineRule="auto"/>
+            </w:pPr>
+            <w:r>
+              <w:rPr>
+                <w:rFonts w:ascii="Times New Roman" w:hAnsi="Times New Roman"/>
+                <w:sz w:val="19"/>
+              </w:rPr>
+              <w:t>10 млн+ установок; 269 тыс. отзывов; множество форматов, 10+ тем и большое число настраиваемых действий.</w:t>
+            </w:r>
+          </w:p>
+        </w:tc>
+        <w:tc>
+          <w:tcPr>
+            <w:tcW w:type="dxa" w:w="2480"/>
+          </w:tcPr>
+          <w:p>
+            <w:pPr>
+              <w:spacing w:line="240" w:lineRule="auto"/>
+            </w:pPr>
+            <w:r>
+              <w:rPr>
+                <w:rFonts w:ascii="Times New Roman" w:hAnsi="Times New Roman"/>
+                <w:sz w:val="19"/>
+              </w:rPr>
+              <w:t>Высокая насыщенность функциями; открытая книга и луна.</w:t>
+            </w:r>
+          </w:p>
+        </w:tc>
+        <w:tc>
+          <w:tcPr>
+            <w:tcW w:type="dxa" w:w="2480"/>
+          </w:tcPr>
+          <w:p>
+            <w:pPr>
+              <w:spacing w:line="240" w:lineRule="auto"/>
+            </w:pPr>
+            <w:r>
+              <w:rPr>
+                <w:rFonts w:ascii="Times New Roman" w:hAnsi="Times New Roman"/>
+                <w:sz w:val="19"/>
+              </w:rPr>
+              <w:t>Не конкурировать визуальной и функциональной перегруженностью. [3]</w:t>
+            </w:r>
+          </w:p>
+        </w:tc>
+      </w:tr>
+      <w:tr>
+        <w:tc>
+          <w:tcPr>
+            <w:tcW w:type="dxa" w:w="2480"/>
+          </w:tcPr>
+          <w:p>
+            <w:pPr>
+              <w:spacing w:line="240" w:lineRule="auto"/>
+            </w:pPr>
+            <w:r>
+              <w:rPr>
+                <w:rFonts w:ascii="Times New Roman" w:hAnsi="Times New Roman"/>
+                <w:sz w:val="19"/>
+              </w:rPr>
+              <w:t>PocketBook Reader</w:t>
+            </w:r>
+          </w:p>
+        </w:tc>
+        <w:tc>
+          <w:tcPr>
+            <w:tcW w:type="dxa" w:w="2480"/>
+          </w:tcPr>
+          <w:p>
+            <w:pPr>
+              <w:spacing w:line="240" w:lineRule="auto"/>
+            </w:pPr>
+            <w:r>
+              <w:rPr>
+                <w:rFonts w:ascii="Times New Roman" w:hAnsi="Times New Roman"/>
+                <w:sz w:val="19"/>
+              </w:rPr>
+              <w:t>10 млн+ установок; 102 тыс. отзывов; 26 форматов; TTS, синхронизация, облако, заметки и библиотека.</w:t>
+            </w:r>
+          </w:p>
+        </w:tc>
+        <w:tc>
+          <w:tcPr>
+            <w:tcW w:type="dxa" w:w="2480"/>
+          </w:tcPr>
+          <w:p>
+            <w:pPr>
+              <w:spacing w:line="240" w:lineRule="auto"/>
+            </w:pPr>
+            <w:r>
+              <w:rPr>
+                <w:rFonts w:ascii="Times New Roman" w:hAnsi="Times New Roman"/>
+                <w:sz w:val="19"/>
+              </w:rPr>
+              <w:t>Сильный охват: книги, облако, магазин; группа книг.</w:t>
+            </w:r>
+          </w:p>
+        </w:tc>
+        <w:tc>
+          <w:tcPr>
+            <w:tcW w:type="dxa" w:w="2480"/>
+          </w:tcPr>
+          <w:p>
+            <w:pPr>
+              <w:spacing w:line="240" w:lineRule="auto"/>
+            </w:pPr>
+            <w:r>
+              <w:rPr>
+                <w:rFonts w:ascii="Times New Roman" w:hAnsi="Times New Roman"/>
+                <w:sz w:val="19"/>
+              </w:rPr>
+              <w:t>Позиционировать BookReader как более узкий и спокойный инструмент. [4]</w:t>
+            </w:r>
+          </w:p>
+        </w:tc>
+      </w:tr>
+      <w:tr>
+        <w:tc>
+          <w:tcPr>
+            <w:tcW w:type="dxa" w:w="2480"/>
+          </w:tcPr>
+          <w:p>
+            <w:pPr>
+              <w:spacing w:line="240" w:lineRule="auto"/>
+            </w:pPr>
+            <w:r>
+              <w:rPr>
+                <w:rFonts w:ascii="Times New Roman" w:hAnsi="Times New Roman"/>
+                <w:sz w:val="19"/>
+              </w:rPr>
+              <w:t>Kindle</w:t>
+            </w:r>
+          </w:p>
+        </w:tc>
+        <w:tc>
+          <w:tcPr>
+            <w:tcW w:type="dxa" w:w="2480"/>
+          </w:tcPr>
+          <w:p>
+            <w:pPr>
+              <w:spacing w:line="240" w:lineRule="auto"/>
+            </w:pPr>
+            <w:r>
+              <w:rPr>
+                <w:rFonts w:ascii="Times New Roman" w:hAnsi="Times New Roman"/>
+                <w:sz w:val="19"/>
+              </w:rPr>
+              <w:t>100 млн+ установок; 4,8 млн отзывов; большой каталог, настройка текста, прогресс и сервисные функции.</w:t>
+            </w:r>
+          </w:p>
+        </w:tc>
+        <w:tc>
+          <w:tcPr>
+            <w:tcW w:type="dxa" w:w="2480"/>
+          </w:tcPr>
+          <w:p>
+            <w:pPr>
+              <w:spacing w:line="240" w:lineRule="auto"/>
+            </w:pPr>
+            <w:r>
+              <w:rPr>
+                <w:rFonts w:ascii="Times New Roman" w:hAnsi="Times New Roman"/>
+                <w:sz w:val="19"/>
+              </w:rPr>
+              <w:t>Сильный экосистемный бренд.</w:t>
+            </w:r>
+          </w:p>
+        </w:tc>
+        <w:tc>
+          <w:tcPr>
+            <w:tcW w:type="dxa" w:w="2480"/>
+          </w:tcPr>
+          <w:p>
+            <w:pPr>
+              <w:spacing w:line="240" w:lineRule="auto"/>
+            </w:pPr>
+            <w:r>
+              <w:rPr>
+                <w:rFonts w:ascii="Times New Roman" w:hAnsi="Times New Roman"/>
+                <w:sz w:val="19"/>
+              </w:rPr>
+              <w:t>Не конкурировать с экосистемой контента; строиться вокруг чтения/слушания. [5]</w:t>
+            </w:r>
+          </w:p>
+        </w:tc>
+      </w:tr>
+    </w:tbl>
+    <w:p>
+      <w:pPr>
+        <w:spacing w:line="360" w:lineRule="auto"/>
+        <w:ind w:firstLine="709"/>
+        <w:jc w:val="both"/>
+      </w:pPr>
+      <w:r>
+        <w:rPr>
+          <w:rFonts w:ascii="Times New Roman" w:hAnsi="Times New Roman"/>
+          <w:sz w:val="28"/>
+        </w:rPr>
+        <w:t>Исследование целевой аудитории. По данным Pew Research Center, опубликованным 08.04.2026, среди взрослых 18–29 лет 41% сообщили о чтении электронных книг за последние 12 месяцев и 32% — о прослушивании аудиокниг; для группы 30–49 лет показатели составили 33% и 33%. Исследование проведено в США, поэтому оно используется только как общий ориентир и не переносится напрямую на российский рынок [6].</w:t>
       </w:r>
     </w:p>
     <w:p>
       <w:pPr>
-        <w:rPr>
-          <w:lang w:val="ru-RU"/>
-        </w:rPr>
-      </w:pPr>
-      <w:r>
-        <w:rPr>
-          <w:lang w:val="ru-RU"/>
-        </w:rPr>
-        <w:t xml:space="preserve">Разработать цельную визуальную систему </w:t>
-      </w:r>
-      <w:r>
-        <w:t>BookReader</w:t>
-      </w:r>
-      <w:r>
-        <w:rPr>
-          <w:lang w:val="ru-RU"/>
-        </w:rPr>
-        <w:t xml:space="preserve"> для мобильного приложения чтения электронных книг с синтезом речи. Система должна обеспечить узнаваемый образ проекта и единое визуальное поведение на основных цифровых и </w:t>
-      </w:r>
-      <w:r>
-        <w:rPr>
-          <w:lang w:val="ru-RU"/>
-        </w:rPr>
-        <w:t>презентационных носителях.</w:t>
+        <w:spacing w:line="360" w:lineRule="auto"/>
+        <w:ind w:firstLine="709"/>
+        <w:jc w:val="both"/>
+      </w:pPr>
+      <w:r>
+        <w:rPr>
+          <w:rFonts w:ascii="Times New Roman" w:hAnsi="Times New Roman"/>
+          <w:sz w:val="28"/>
+        </w:rPr>
+        <w:t>Наблюдение по пользовательскому поведению дополнено отзывами ReadEra: пользователи описывают использование приложения и для чтения, и для прослушивания, когда заняты другими делами. Это поддерживает гипотезу о ценности быстрого переключения между чтением и TTS, но одновременно подтверждает, что сама функция TTS уже присутствует у конкурентов [1].</w:t>
       </w:r>
     </w:p>
     <w:p>
       <w:pPr>
-        <w:pStyle w:val="21"/>
-        <w:rPr>
-          <w:lang w:val="ru-RU"/>
-        </w:rPr>
-      </w:pPr>
-      <w:r>
-        <w:rPr>
-          <w:lang w:val="ru-RU"/>
-        </w:rPr>
-        <w:t>3.2. Задачи дизайна</w:t>
+        <w:spacing w:line="360" w:lineRule="auto"/>
+        <w:ind w:firstLine="709"/>
+        <w:jc w:val="both"/>
+      </w:pPr>
+      <w:r>
+        <w:rPr>
+          <w:rFonts w:ascii="Times New Roman" w:hAnsi="Times New Roman"/>
+          <w:sz w:val="28"/>
+        </w:rPr>
+        <w:t>Исследование визуального языка. В значках и описаниях аналогов повторяются буквальные метафоры чтения: открытая книга, закладка, группа книг, а у части продуктов — дополнительные образы вроде луны [1–5]. Поэтому ограничение на клише «книга + наушники» и направление «текст → звук» являются выводом визуального анализа категории.</w:t>
       </w:r>
     </w:p>
     <w:p>
       <w:pPr>
-        <w:ind w:left="340" w:hanging="340"/>
-        <w:rPr>
-          <w:lang w:val="ru-RU"/>
-        </w:rPr>
-      </w:pPr>
-      <w:r>
-        <w:rPr>
-          <w:lang w:val="ru-RU"/>
-        </w:rPr>
-        <w:t>• Разработать направление логотипа и знак проекта.</w:t>
+        <w:spacing w:line="360" w:lineRule="auto"/>
+        <w:ind w:firstLine="709"/>
+        <w:jc w:val="both"/>
+      </w:pPr>
+      <w:r>
+        <w:rPr>
+          <w:rFonts w:ascii="Times New Roman" w:hAnsi="Times New Roman"/>
+          <w:sz w:val="28"/>
+        </w:rPr>
+        <w:t>Исследование цифровых правил. Android рекомендует использовать явную типографическую иерархию и достаточный контраст, а Material 3 даёт системную шкалу форм и показывает связь формы с иерархией и брендингом [7]. Поэтому в ТЗ закреплены проверяемые требования к читаемости, контрасту, иерархии и последовательности форм.</w:t>
       </w:r>
     </w:p>
     <w:p>
       <w:pPr>
-        <w:ind w:left="340" w:hanging="340"/>
-        <w:rPr>
-          <w:lang w:val="ru-RU"/>
-        </w:rPr>
-      </w:pPr>
-      <w:r>
-        <w:rPr>
-          <w:lang w:val="ru-RU"/>
-        </w:rPr>
-        <w:t>• Разработать иконку мобильного приложения на основе утверждённого графического принципа.</w:t>
+        <w:pStyle w:val="21"/>
+      </w:pPr>
+      <w:r>
+        <w:rPr>
+          <w:rFonts w:ascii="Times New Roman" w:hAnsi="Times New Roman"/>
+          <w:b/>
+          <w:sz w:val="28"/>
+        </w:rPr>
+        <w:t>Связь исследования с решениями брифа и ТЗ</w:t>
+      </w:r>
+    </w:p>
+    <w:tbl>
+      <w:tblPr>
+        <w:tblStyle w:val="aff0"/>
+        <w:tblW w:type="auto" w:w="0"/>
+        <w:jc w:val="center"/>
+        <w:tblLook w:firstColumn="1" w:firstRow="1" w:lastColumn="0" w:lastRow="0" w:noHBand="0" w:noVBand="1" w:val="04A0"/>
+      </w:tblPr>
+      <w:tblGrid>
+        <w:gridCol w:w="3307"/>
+        <w:gridCol w:w="3307"/>
+        <w:gridCol w:w="3307"/>
+      </w:tblGrid>
+      <w:tr>
+        <w:tc>
+          <w:tcPr>
+            <w:tcW w:type="dxa" w:w="3307"/>
+            <w:shd w:fill="E6EED5"/>
+          </w:tcPr>
+          <w:p>
+            <w:pPr>
+              <w:jc w:val="center"/>
+            </w:pPr>
+            <w:r>
+              <w:rPr>
+                <w:rFonts w:ascii="Times New Roman" w:hAnsi="Times New Roman"/>
+                <w:b/>
+                <w:sz w:val="20"/>
+              </w:rPr>
+              <w:t>Пункт</w:t>
+            </w:r>
+          </w:p>
+        </w:tc>
+        <w:tc>
+          <w:tcPr>
+            <w:tcW w:type="dxa" w:w="3307"/>
+            <w:shd w:fill="E6EED5"/>
+          </w:tcPr>
+          <w:p>
+            <w:pPr>
+              <w:jc w:val="center"/>
+            </w:pPr>
+            <w:r>
+              <w:rPr>
+                <w:rFonts w:ascii="Times New Roman" w:hAnsi="Times New Roman"/>
+                <w:b/>
+                <w:sz w:val="20"/>
+              </w:rPr>
+              <w:t>Основание</w:t>
+            </w:r>
+          </w:p>
+        </w:tc>
+        <w:tc>
+          <w:tcPr>
+            <w:tcW w:type="dxa" w:w="3307"/>
+            <w:shd w:fill="E6EED5"/>
+          </w:tcPr>
+          <w:p>
+            <w:pPr>
+              <w:jc w:val="center"/>
+            </w:pPr>
+            <w:r>
+              <w:rPr>
+                <w:rFonts w:ascii="Times New Roman" w:hAnsi="Times New Roman"/>
+                <w:b/>
+                <w:sz w:val="20"/>
+              </w:rPr>
+              <w:t>Итоговое решение</w:t>
+            </w:r>
+          </w:p>
+        </w:tc>
+      </w:tr>
+      <w:tr>
+        <w:tc>
+          <w:tcPr>
+            <w:tcW w:type="dxa" w:w="3307"/>
+          </w:tcPr>
+          <w:p>
+            <w:pPr>
+              <w:spacing w:line="240" w:lineRule="auto"/>
+            </w:pPr>
+            <w:r>
+              <w:rPr>
+                <w:rFonts w:ascii="Times New Roman" w:hAnsi="Times New Roman"/>
+                <w:sz w:val="19"/>
+              </w:rPr>
+              <w:t>Целевая аудитория</w:t>
+            </w:r>
+          </w:p>
+        </w:tc>
+        <w:tc>
+          <w:tcPr>
+            <w:tcW w:type="dxa" w:w="3307"/>
+          </w:tcPr>
+          <w:p>
+            <w:pPr>
+              <w:spacing w:line="240" w:lineRule="auto"/>
+            </w:pPr>
+            <w:r>
+              <w:rPr>
+                <w:rFonts w:ascii="Times New Roman" w:hAnsi="Times New Roman"/>
+                <w:sz w:val="19"/>
+              </w:rPr>
+              <w:t>Внешнее исследование + анализ сценария</w:t>
+            </w:r>
+          </w:p>
+        </w:tc>
+        <w:tc>
+          <w:tcPr>
+            <w:tcW w:type="dxa" w:w="3307"/>
+          </w:tcPr>
+          <w:p>
+            <w:pPr>
+              <w:spacing w:line="240" w:lineRule="auto"/>
+            </w:pPr>
+            <w:r>
+              <w:rPr>
+                <w:rFonts w:ascii="Times New Roman" w:hAnsi="Times New Roman"/>
+                <w:sz w:val="19"/>
+              </w:rPr>
+              <w:t>18–49 лет — рабочая гипотеза; акцент на совмещении чтения и слушания.</w:t>
+            </w:r>
+          </w:p>
+        </w:tc>
+      </w:tr>
+      <w:tr>
+        <w:tc>
+          <w:tcPr>
+            <w:tcW w:type="dxa" w:w="3307"/>
+          </w:tcPr>
+          <w:p>
+            <w:pPr>
+              <w:spacing w:line="240" w:lineRule="auto"/>
+            </w:pPr>
+            <w:r>
+              <w:rPr>
+                <w:rFonts w:ascii="Times New Roman" w:hAnsi="Times New Roman"/>
+                <w:sz w:val="19"/>
+              </w:rPr>
+              <w:t>Конкуренты</w:t>
+            </w:r>
+          </w:p>
+        </w:tc>
+        <w:tc>
+          <w:tcPr>
+            <w:tcW w:type="dxa" w:w="3307"/>
+          </w:tcPr>
+          <w:p>
+            <w:pPr>
+              <w:spacing w:line="240" w:lineRule="auto"/>
+            </w:pPr>
+            <w:r>
+              <w:rPr>
+                <w:rFonts w:ascii="Times New Roman" w:hAnsi="Times New Roman"/>
+                <w:sz w:val="19"/>
+              </w:rPr>
+              <w:t>Анализ пяти реальных аналогов</w:t>
+            </w:r>
+          </w:p>
+        </w:tc>
+        <w:tc>
+          <w:tcPr>
+            <w:tcW w:type="dxa" w:w="3307"/>
+          </w:tcPr>
+          <w:p>
+            <w:pPr>
+              <w:spacing w:line="240" w:lineRule="auto"/>
+            </w:pPr>
+            <w:r>
+              <w:rPr>
+                <w:rFonts w:ascii="Times New Roman" w:hAnsi="Times New Roman"/>
+                <w:sz w:val="19"/>
+              </w:rPr>
+              <w:t>Зафиксированы конкуренты, насыщенность категории и отсутствие уникальности TTS.</w:t>
+            </w:r>
+          </w:p>
+        </w:tc>
+      </w:tr>
+      <w:tr>
+        <w:tc>
+          <w:tcPr>
+            <w:tcW w:type="dxa" w:w="3307"/>
+          </w:tcPr>
+          <w:p>
+            <w:pPr>
+              <w:spacing w:line="240" w:lineRule="auto"/>
+            </w:pPr>
+            <w:r>
+              <w:rPr>
+                <w:rFonts w:ascii="Times New Roman" w:hAnsi="Times New Roman"/>
+                <w:sz w:val="19"/>
+              </w:rPr>
+              <w:t>Визуальный образ</w:t>
+            </w:r>
+          </w:p>
+        </w:tc>
+        <w:tc>
+          <w:tcPr>
+            <w:tcW w:type="dxa" w:w="3307"/>
+          </w:tcPr>
+          <w:p>
+            <w:pPr>
+              <w:spacing w:line="240" w:lineRule="auto"/>
+            </w:pPr>
+            <w:r>
+              <w:rPr>
+                <w:rFonts w:ascii="Times New Roman" w:hAnsi="Times New Roman"/>
+                <w:sz w:val="19"/>
+              </w:rPr>
+              <w:t>Визуальный аудит аналогов</w:t>
+            </w:r>
+          </w:p>
+        </w:tc>
+        <w:tc>
+          <w:tcPr>
+            <w:tcW w:type="dxa" w:w="3307"/>
+          </w:tcPr>
+          <w:p>
+            <w:pPr>
+              <w:spacing w:line="240" w:lineRule="auto"/>
+            </w:pPr>
+            <w:r>
+              <w:rPr>
+                <w:rFonts w:ascii="Times New Roman" w:hAnsi="Times New Roman"/>
+                <w:sz w:val="19"/>
+              </w:rPr>
+              <w:t>Отказ от клише «книга + наушники»; направление «текст → звук».</w:t>
+            </w:r>
+          </w:p>
+        </w:tc>
+      </w:tr>
+      <w:tr>
+        <w:tc>
+          <w:tcPr>
+            <w:tcW w:type="dxa" w:w="3307"/>
+          </w:tcPr>
+          <w:p>
+            <w:pPr>
+              <w:spacing w:line="240" w:lineRule="auto"/>
+            </w:pPr>
+            <w:r>
+              <w:rPr>
+                <w:rFonts w:ascii="Times New Roman" w:hAnsi="Times New Roman"/>
+                <w:sz w:val="19"/>
+              </w:rPr>
+              <w:t>Цвет и типографика</w:t>
+            </w:r>
+          </w:p>
+        </w:tc>
+        <w:tc>
+          <w:tcPr>
+            <w:tcW w:type="dxa" w:w="3307"/>
+          </w:tcPr>
+          <w:p>
+            <w:pPr>
+              <w:spacing w:line="240" w:lineRule="auto"/>
+            </w:pPr>
+            <w:r>
+              <w:rPr>
+                <w:rFonts w:ascii="Times New Roman" w:hAnsi="Times New Roman"/>
+                <w:sz w:val="19"/>
+              </w:rPr>
+              <w:t>Визуальный аудит + Android/Material</w:t>
+            </w:r>
+          </w:p>
+        </w:tc>
+        <w:tc>
+          <w:tcPr>
+            <w:tcW w:type="dxa" w:w="3307"/>
+          </w:tcPr>
+          <w:p>
+            <w:pPr>
+              <w:spacing w:line="240" w:lineRule="auto"/>
+            </w:pPr>
+            <w:r>
+              <w:rPr>
+                <w:rFonts w:ascii="Times New Roman" w:hAnsi="Times New Roman"/>
+                <w:sz w:val="19"/>
+              </w:rPr>
+              <w:t>Палитра — рабочая гипотеза; обязательны контраст и иерархия.</w:t>
+            </w:r>
+          </w:p>
+        </w:tc>
+      </w:tr>
+      <w:tr>
+        <w:tc>
+          <w:tcPr>
+            <w:tcW w:type="dxa" w:w="3307"/>
+          </w:tcPr>
+          <w:p>
+            <w:pPr>
+              <w:spacing w:line="240" w:lineRule="auto"/>
+            </w:pPr>
+            <w:r>
+              <w:rPr>
+                <w:rFonts w:ascii="Times New Roman" w:hAnsi="Times New Roman"/>
+                <w:sz w:val="19"/>
+              </w:rPr>
+              <w:t>Позиционирование</w:t>
+            </w:r>
+          </w:p>
+        </w:tc>
+        <w:tc>
+          <w:tcPr>
+            <w:tcW w:type="dxa" w:w="3307"/>
+          </w:tcPr>
+          <w:p>
+            <w:pPr>
+              <w:spacing w:line="240" w:lineRule="auto"/>
+            </w:pPr>
+            <w:r>
+              <w:rPr>
+                <w:rFonts w:ascii="Times New Roman" w:hAnsi="Times New Roman"/>
+                <w:sz w:val="19"/>
+              </w:rPr>
+              <w:t>Сопоставление функций и визуального языка</w:t>
+            </w:r>
+          </w:p>
+        </w:tc>
+        <w:tc>
+          <w:tcPr>
+            <w:tcW w:type="dxa" w:w="3307"/>
+          </w:tcPr>
+          <w:p>
+            <w:pPr>
+              <w:spacing w:line="240" w:lineRule="auto"/>
+            </w:pPr>
+            <w:r>
+              <w:rPr>
+                <w:rFonts w:ascii="Times New Roman" w:hAnsi="Times New Roman"/>
+                <w:sz w:val="19"/>
+              </w:rPr>
+              <w:t>Спокойный инструмент с коротким базовым сценарием.</w:t>
+            </w:r>
+          </w:p>
+        </w:tc>
+      </w:tr>
+    </w:tbl>
+    <w:p>
+      <w:pPr>
+        <w:pStyle w:val="21"/>
+      </w:pPr>
+      <w:r>
+        <w:rPr>
+          <w:rFonts w:ascii="Times New Roman" w:hAnsi="Times New Roman"/>
+          <w:b/>
+          <w:sz w:val="28"/>
+        </w:rPr>
+        <w:t>Источники исследования</w:t>
       </w:r>
     </w:p>
     <w:p>
       <w:pPr>
-        <w:ind w:left="340" w:hanging="340"/>
-        <w:rPr>
-          <w:lang w:val="ru-RU"/>
-        </w:rPr>
-      </w:pPr>
-      <w:r>
-        <w:rPr>
-          <w:lang w:val="ru-RU"/>
-        </w:rPr>
-        <w:t>• Зафиксировать основную и акцентную цветовую систему.</w:t>
+        <w:spacing w:line="240" w:lineRule="auto"/>
+        <w:ind w:firstLine="0"/>
+        <w:jc w:val="left"/>
+      </w:pPr>
+      <w:r>
+        <w:rPr>
+          <w:rFonts w:ascii="Times New Roman" w:hAnsi="Times New Roman"/>
+          <w:sz w:val="20"/>
+        </w:rPr>
+        <w:t>[1] Google Play. ReadEra — читалка книг fb2 pdf epub. https://play.google.com/store/apps/details?id=org.readera (доступ: 05.10.2026).</w:t>
       </w:r>
     </w:p>
     <w:p>
       <w:pPr>
-        <w:ind w:left="340" w:hanging="340"/>
-        <w:rPr>
-          <w:lang w:val="ru-RU"/>
-        </w:rPr>
-      </w:pPr>
-      <w:r>
-        <w:rPr>
-          <w:lang w:val="ru-RU"/>
-        </w:rPr>
-        <w:t xml:space="preserve">• </w:t>
-      </w:r>
-      <w:r>
-        <w:rPr>
-          <w:lang w:val="ru-RU"/>
-        </w:rPr>
-        <w:t>Подобрать иерархию типографики для интерфейса и коммуникационных материалов.</w:t>
+        <w:spacing w:line="240" w:lineRule="auto"/>
+        <w:ind w:firstLine="0"/>
+        <w:jc w:val="left"/>
+      </w:pPr>
+      <w:r>
+        <w:rPr>
+          <w:rFonts w:ascii="Times New Roman" w:hAnsi="Times New Roman"/>
+          <w:sz w:val="20"/>
+        </w:rPr>
+        <w:t>[2] FBReader. Для Android — официальная страница приложения. https://fbreader.org/ru/android (доступ: 05.10.2026).</w:t>
       </w:r>
     </w:p>
     <w:p>
       <w:pPr>
-        <w:ind w:left="340" w:hanging="340"/>
-        <w:rPr>
-          <w:lang w:val="ru-RU"/>
-        </w:rPr>
-      </w:pPr>
-      <w:r>
-        <w:rPr>
-          <w:lang w:val="ru-RU"/>
-        </w:rPr>
-        <w:t>• Сформировать систему иконок и повторяемых графических элементов.</w:t>
+        <w:spacing w:line="240" w:lineRule="auto"/>
+        <w:ind w:firstLine="0"/>
+        <w:jc w:val="left"/>
+      </w:pPr>
+      <w:r>
+        <w:rPr>
+          <w:rFonts w:ascii="Times New Roman" w:hAnsi="Times New Roman"/>
+          <w:sz w:val="20"/>
+        </w:rPr>
+        <w:t>[3] Google Play. Moon+ Reader. https://play.google.com/store/apps/details?id=com.flyersoft.moonreader (доступ: 05.10.2026).</w:t>
       </w:r>
     </w:p>
     <w:p>
       <w:pPr>
-        <w:ind w:left="340" w:hanging="340"/>
-        <w:rPr>
-          <w:lang w:val="ru-RU"/>
-        </w:rPr>
-      </w:pPr>
-      <w:r>
-        <w:rPr>
-          <w:lang w:val="ru-RU"/>
-        </w:rPr>
-        <w:t>• Разработать визуальные правила для библиотеки, карточки книги, чтения и настроек.</w:t>
+        <w:spacing w:line="240" w:lineRule="auto"/>
+        <w:ind w:firstLine="0"/>
+        <w:jc w:val="left"/>
+      </w:pPr>
+      <w:r>
+        <w:rPr>
+          <w:rFonts w:ascii="Times New Roman" w:hAnsi="Times New Roman"/>
+          <w:sz w:val="20"/>
+        </w:rPr>
+        <w:t>[4] Google Play. PocketBook reader — EPUB, PDF. https://play.google.com/store/apps/details?id=com.obreey.reader (доступ: 05.10.2026).</w:t>
       </w:r>
     </w:p>
     <w:p>
       <w:pPr>
-        <w:ind w:left="340" w:hanging="340"/>
-        <w:rPr>
-          <w:lang w:val="ru-RU"/>
-        </w:rPr>
-      </w:pPr>
-      <w:r>
-        <w:rPr>
-          <w:lang w:val="ru-RU"/>
-        </w:rPr>
-        <w:t>• Подготовить решения для ци</w:t>
-      </w:r>
-      <w:r>
-        <w:rPr>
-          <w:lang w:val="ru-RU"/>
-        </w:rPr>
-        <w:t>фровых носителей и минимум одного печатного носителя.</w:t>
+        <w:spacing w:line="240" w:lineRule="auto"/>
+        <w:ind w:firstLine="0"/>
+        <w:jc w:val="left"/>
+      </w:pPr>
+      <w:r>
+        <w:rPr>
+          <w:rFonts w:ascii="Times New Roman" w:hAnsi="Times New Roman"/>
+          <w:sz w:val="20"/>
+        </w:rPr>
+        <w:t>[5] Google Play. Amazon Kindle: Reading App. https://play.google.com/store/apps/details?id=com.amazon.kindle (доступ: 05.10.2026).</w:t>
       </w:r>
     </w:p>
     <w:p>
       <w:pPr>
-        <w:ind w:left="340" w:hanging="340"/>
-        <w:rPr>
-          <w:lang w:val="ru-RU"/>
-        </w:rPr>
-      </w:pPr>
-      <w:r>
-        <w:rPr>
-          <w:lang w:val="ru-RU"/>
-        </w:rPr>
-        <w:t>• Сформировать набор правил, который можно перенести в итоговый брендбук.</w:t>
+        <w:spacing w:line="240" w:lineRule="auto"/>
+        <w:ind w:firstLine="0"/>
+        <w:jc w:val="left"/>
+      </w:pPr>
+      <w:r>
+        <w:rPr>
+          <w:rFonts w:ascii="Times New Roman" w:hAnsi="Times New Roman"/>
+          <w:sz w:val="20"/>
+        </w:rPr>
+        <w:t>[6] Pew Research Center. Book reading habits in the U.S. vary by education, age and other factors. 08.04.2026. https://www.pewresearch.org/chart/book-reading-habits-in-the-u-s-vary-by-education-age-and-other-factors/ (доступ: 05.10.2026).</w:t>
       </w:r>
     </w:p>
     <w:p>
       <w:pPr>
-        <w:pStyle w:val="21"/>
-        <w:rPr>
-          <w:lang w:val="ru-RU"/>
-        </w:rPr>
-      </w:pPr>
-      <w:r>
-        <w:rPr>
-          <w:lang w:val="ru-RU"/>
-        </w:rPr>
-        <w:t>3.3. Описание целевой аудитории</w:t>
+        <w:spacing w:line="240" w:lineRule="auto"/>
+        <w:ind w:firstLine="0"/>
+        <w:jc w:val="left"/>
+      </w:pPr>
+      <w:r>
+        <w:rPr>
+          <w:rFonts w:ascii="Times New Roman" w:hAnsi="Times New Roman"/>
+          <w:sz w:val="20"/>
+        </w:rPr>
+        <w:t>[7] Android Developers. Material Design 3 и Accessibility. https://developer.android.com/codelabs/m3-design-theming и https://developer.android.com/design/ui/mobile/guides/foundations/accessibility (доступ: 05.10.2026).</w:t>
       </w:r>
     </w:p>
     <w:p>
       <w:pPr>
-        <w:rPr>
-          <w:lang w:val="ru-RU"/>
-        </w:rPr>
-      </w:pPr>
-      <w:r>
-        <w:rPr>
-          <w:lang w:val="ru-RU"/>
-        </w:rPr>
-        <w:t xml:space="preserve">Целевая аудитория — пользователи </w:t>
-      </w:r>
-      <w:r>
-        <w:t>Android</w:t>
-      </w:r>
-      <w:r>
-        <w:rPr>
-          <w:lang w:val="ru-RU"/>
-        </w:rPr>
-        <w:t xml:space="preserve"> 18–45 лет, читающие электронные книги и использующие си</w:t>
-      </w:r>
-      <w:r>
-        <w:rPr>
-          <w:lang w:val="ru-RU"/>
-        </w:rPr>
-        <w:t>нтез речи как дополнительный способ потребления текста. Пользователь ожидает быстрых действий, визуального порядка и комфортного длительного чтения. Дизайн должен учитывать частое взаимодействие с текстом и необходимость быстро находить состояние озвучиван</w:t>
-      </w:r>
-      <w:r>
-        <w:rPr>
-          <w:lang w:val="ru-RU"/>
-        </w:rPr>
-        <w:t>ия, прогресса и текущей книги.</w:t>
+        <w:spacing w:line="360" w:lineRule="auto"/>
+        <w:ind w:firstLine="709"/>
+        <w:jc w:val="both"/>
+      </w:pPr>
+      <w:r>
+        <w:rPr>
+          <w:rFonts w:ascii="Times New Roman" w:hAnsi="Times New Roman"/>
+          <w:b/>
+          <w:sz w:val="28"/>
+        </w:rPr>
+        <w:t>Принцип работы с отмеченными преподавателем пунктами: фактические сведения отделены от дизайнерских гипотез. Там, где ответ подтверждается внешним источником, приведено основание; там, где речь идёт о будущем графическом решении, оно обозначено как проектная гипотеза и связано с результатом анализа. Это позволяет не выдавать предположение за исследовательский факт и одновременно сохранить конкретность брифа.</w:t>
       </w:r>
     </w:p>
     <w:p>
       <w:pPr>
-        <w:pStyle w:val="21"/>
-        <w:rPr>
-          <w:lang w:val="ru-RU"/>
-        </w:rPr>
-      </w:pPr>
-      <w:r>
-        <w:rPr>
-          <w:lang w:val="ru-RU"/>
-        </w:rPr>
-        <w:t>3.4. Позиционирование бренда</w:t>
+        <w:pStyle w:val="1"/>
+        <w:rPr>
+          <w:lang w:val="ru-RU"/>
+        </w:rPr>
+      </w:pPr>
+      <w:r>
+        <w:rPr>
+          <w:lang w:val="ru-RU"/>
+        </w:rPr>
+        <w:t>3. Тех</w:t>
+      </w:r>
+      <w:r>
+        <w:rPr>
+          <w:lang w:val="ru-RU"/>
+        </w:rPr>
+        <w:t>ническое задание</w:t>
       </w:r>
     </w:p>
     <w:p>
       <w:pPr>
-        <w:rPr>
-          <w:lang w:val="ru-RU"/>
-        </w:rPr>
-      </w:pPr>
+        <w:pStyle w:val="21"/>
+        <w:rPr>
+          <w:lang w:val="ru-RU"/>
+        </w:rPr>
+      </w:pPr>
+      <w:r>
+        <w:rPr>
+          <w:lang w:val="ru-RU"/>
+        </w:rPr>
+        <w:t>3.1. Цель проекта</w:t>
+      </w:r>
+    </w:p>
+    <w:p>
+      <w:pPr>
+        <w:rPr>
+          <w:lang w:val="ru-RU"/>
+        </w:rPr>
+      </w:pPr>
+      <w:r>
+        <w:rPr>
+          <w:lang w:val="ru-RU"/>
+        </w:rPr>
+        <w:t xml:space="preserve">Разработать цельную визуальную систему </w:t>
+      </w:r>
       <w:r>
         <w:t>BookReader</w:t>
       </w:r>
@@ -3013,20 +3534,207 @@
         <w:rPr>
           <w:lang w:val="ru-RU"/>
         </w:rPr>
-        <w:t xml:space="preserve"> — спокойный и технологичный инструмент для тех, кто хочет хранить, читать и слушать электронные книги в одном месте. Визуальное позиционирование строится </w:t>
-      </w:r>
-      <w:r>
-        <w:rPr>
-          <w:lang w:val="ru-RU"/>
-        </w:rPr>
-        <w:lastRenderedPageBreak/>
-        <w:t xml:space="preserve">вокруг идеи «книга без лишнего </w:t>
-      </w:r>
-      <w:r>
-        <w:rPr>
-          <w:lang w:val="ru-RU"/>
-        </w:rPr>
-        <w:t>интерфейса»: контент является главным, интерфейс помогает, но не конкурирует с ним.</w:t>
+        <w:t xml:space="preserve"> для мобильного приложения чтения электронных книг с синтезом речи. Система должна обеспечить узнаваемый образ проекта и единое визуальное поведение на основных цифровых и </w:t>
+      </w:r>
+      <w:r>
+        <w:rPr>
+          <w:lang w:val="ru-RU"/>
+        </w:rPr>
+        <w:t>презентационных носителях.</w:t>
+      </w:r>
+    </w:p>
+    <w:p>
+      <w:pPr>
+        <w:pStyle w:val="21"/>
+        <w:rPr>
+          <w:lang w:val="ru-RU"/>
+        </w:rPr>
+      </w:pPr>
+      <w:r>
+        <w:rPr>
+          <w:lang w:val="ru-RU"/>
+        </w:rPr>
+        <w:t>3.2. Задачи дизайна</w:t>
+      </w:r>
+    </w:p>
+    <w:p>
+      <w:pPr>
+        <w:ind w:left="340" w:hanging="340"/>
+        <w:rPr>
+          <w:lang w:val="ru-RU"/>
+        </w:rPr>
+      </w:pPr>
+      <w:r>
+        <w:rPr>
+          <w:lang w:val="ru-RU"/>
+        </w:rPr>
+        <w:t>• Разработать направление логотипа и знак проекта.</w:t>
+      </w:r>
+    </w:p>
+    <w:p>
+      <w:pPr>
+        <w:ind w:left="340" w:hanging="340"/>
+        <w:rPr>
+          <w:lang w:val="ru-RU"/>
+        </w:rPr>
+      </w:pPr>
+      <w:r>
+        <w:rPr>
+          <w:lang w:val="ru-RU"/>
+        </w:rPr>
+        <w:t>• Разработать иконку мобильного приложения на основе утверждённого графического принципа.</w:t>
+      </w:r>
+    </w:p>
+    <w:p>
+      <w:pPr>
+        <w:ind w:left="340" w:hanging="340"/>
+        <w:rPr>
+          <w:lang w:val="ru-RU"/>
+        </w:rPr>
+      </w:pPr>
+      <w:r>
+        <w:rPr>
+          <w:lang w:val="ru-RU"/>
+        </w:rPr>
+        <w:t>• Зафиксировать основную и акцентную цветовую систему.</w:t>
+      </w:r>
+    </w:p>
+    <w:p>
+      <w:pPr>
+        <w:ind w:left="340" w:hanging="340"/>
+        <w:rPr>
+          <w:lang w:val="ru-RU"/>
+        </w:rPr>
+      </w:pPr>
+      <w:r>
+        <w:rPr>
+          <w:lang w:val="ru-RU"/>
+        </w:rPr>
+        <w:t xml:space="preserve">• </w:t>
+      </w:r>
+      <w:r>
+        <w:rPr>
+          <w:lang w:val="ru-RU"/>
+        </w:rPr>
+        <w:t>Подобрать иерархию типографики для интерфейса и коммуникационных материалов.</w:t>
+      </w:r>
+    </w:p>
+    <w:p>
+      <w:pPr>
+        <w:ind w:left="340" w:hanging="340"/>
+        <w:rPr>
+          <w:lang w:val="ru-RU"/>
+        </w:rPr>
+      </w:pPr>
+      <w:r>
+        <w:rPr>
+          <w:lang w:val="ru-RU"/>
+        </w:rPr>
+        <w:t>• Сформировать систему иконок и повторяемых графических элементов.</w:t>
+      </w:r>
+    </w:p>
+    <w:p>
+      <w:pPr>
+        <w:ind w:left="340" w:hanging="340"/>
+        <w:rPr>
+          <w:lang w:val="ru-RU"/>
+        </w:rPr>
+      </w:pPr>
+      <w:r>
+        <w:rPr>
+          <w:lang w:val="ru-RU"/>
+        </w:rPr>
+        <w:t>• Разработать визуальные правила для библиотеки, карточки книги, чтения и настроек.</w:t>
+      </w:r>
+    </w:p>
+    <w:p>
+      <w:pPr>
+        <w:ind w:left="340" w:hanging="340"/>
+        <w:rPr>
+          <w:lang w:val="ru-RU"/>
+        </w:rPr>
+      </w:pPr>
+      <w:r>
+        <w:rPr>
+          <w:lang w:val="ru-RU"/>
+        </w:rPr>
+        <w:t>• Подготовить решения для ци</w:t>
+      </w:r>
+      <w:r>
+        <w:rPr>
+          <w:lang w:val="ru-RU"/>
+        </w:rPr>
+        <w:t>фровых носителей и минимум одного печатного носителя.</w:t>
+      </w:r>
+    </w:p>
+    <w:p>
+      <w:pPr>
+        <w:ind w:left="340" w:hanging="340"/>
+        <w:rPr>
+          <w:lang w:val="ru-RU"/>
+        </w:rPr>
+      </w:pPr>
+      <w:r>
+        <w:rPr>
+          <w:lang w:val="ru-RU"/>
+        </w:rPr>
+        <w:t>• Сформировать набор правил, который можно перенести в итоговый брендбук.</w:t>
+      </w:r>
+    </w:p>
+    <w:p>
+      <w:pPr>
+        <w:pStyle w:val="21"/>
+        <w:rPr>
+          <w:lang w:val="ru-RU"/>
+        </w:rPr>
+      </w:pPr>
+      <w:r>
+        <w:rPr>
+          <w:lang w:val="ru-RU"/>
+        </w:rPr>
+        <w:t>3.3. Описание целевой аудитории</w:t>
+      </w:r>
+    </w:p>
+    <w:p>
+      <w:pPr>
+        <w:rPr>
+          <w:lang w:val="ru-RU"/>
+        </w:rPr>
+      </w:pPr>
+      <w:r>
+        <w:rPr>
+          <w:rFonts w:ascii="Times New Roman" w:hAnsi="Times New Roman"/>
+          <w:sz w:val="28"/>
+        </w:rPr>
+        <w:t>Целевая аудитория — пользователи Android, регулярно читающие электронные книги и использующие синтез речи как дополнительный способ потребления текста. Возраст 18–49 лет указан как рабочая исследовательская гипотеза, а не как установленная граница; дальнейшее уточнение аудитории предполагает локальное пользовательское исследование. Пользователь ожидает быстрых действий, визуального порядка и комфортного длительного чтения [6].</w:t>
+      </w:r>
+    </w:p>
+    <w:p>
+      <w:pPr>
+        <w:pStyle w:val="21"/>
+        <w:rPr>
+          <w:lang w:val="ru-RU"/>
+        </w:rPr>
+      </w:pPr>
+      <w:r>
+        <w:rPr>
+          <w:lang w:val="ru-RU"/>
+        </w:rPr>
+        <w:t>3.4. Позиционирование бренда</w:t>
+      </w:r>
+    </w:p>
+    <w:p>
+      <w:pPr>
+        <w:rPr>
+          <w:lang w:val="ru-RU"/>
+        </w:rPr>
+      </w:pPr>
+      <w:r>
+        <w:rPr>
+          <w:rFonts w:ascii="Times New Roman" w:hAnsi="Times New Roman"/>
+          <w:sz w:val="28"/>
+        </w:rPr>
+        <w:t>BookReader — спокойный и технологичный инструмент для тех, кто хочет хранить, читать и слушать электронные книги в одном месте. Такое позиционирование выведено из сопоставления функций и визуального языка исследованных аналогов: BookReader не конкурирует с ними количеством форматов, облачных сервисов или второстепенных функций, а концентрируется на связном сценарии чтения и прослушивания [1–5].</w:t>
       </w:r>
     </w:p>
     <w:p>

</xml_diff>